<commit_message>
Added Github link Verification Plan
</commit_message>
<xml_diff>
--- a/team8_AHB2APB_M1/team8_AHB2APB_M1_DOCS/ece593w25-FunctionVerificationTestPlan_template.docx
+++ b/team8_AHB2APB_M1/team8_AHB2APB_M1_DOCS/ece593w25-FunctionVerificationTestPlan_template.docx
@@ -178,17 +178,25 @@
         <w:spacing w:after="0"/>
         <w:rPr>
           <w:rFonts w:ascii="Calibri" w:hAnsi="Calibri" w:cs="Calibri"/>
+          <w:sz w:val="28"/>
+          <w:szCs w:val="28"/>
+        </w:rPr>
+      </w:pPr>
+      <w:r>
+        <w:rPr>
+          <w:rFonts w:ascii="Calibri" w:hAnsi="Calibri" w:cs="Calibri"/>
           <w:sz w:val="40"/>
           <w:szCs w:val="40"/>
         </w:rPr>
-      </w:pPr>
+        <w:t>Project Name:</w:t>
+      </w:r>
       <w:r>
         <w:rPr>
           <w:rFonts w:ascii="Calibri" w:hAnsi="Calibri" w:cs="Calibri"/>
           <w:sz w:val="40"/>
           <w:szCs w:val="40"/>
         </w:rPr>
-        <w:t>Project Name:</w:t>
+        <w:t xml:space="preserve">  AHB to APB Bridge</w:t>
       </w:r>
       <w:r>
         <w:rPr>
@@ -196,179 +204,198 @@
           <w:sz w:val="40"/>
           <w:szCs w:val="40"/>
         </w:rPr>
-        <w:t xml:space="preserve">  AHB to APB Bridge</w:t>
-      </w:r>
-      <w:r>
+        <w:br/>
+      </w:r>
+      <w:r>
+        <w:rPr>
+          <w:rFonts w:ascii="Calibri" w:hAnsi="Calibri" w:cs="Calibri"/>
+          <w:sz w:val="28"/>
+          <w:szCs w:val="28"/>
+        </w:rPr>
+        <w:t>Members:</w:t>
+      </w:r>
+    </w:p>
+    <w:p>
+      <w:pPr>
+        <w:spacing w:after="0"/>
+        <w:rPr>
+          <w:rFonts w:ascii="Calibri" w:hAnsi="Calibri" w:cs="Calibri"/>
+          <w:sz w:val="28"/>
+          <w:szCs w:val="28"/>
+        </w:rPr>
+      </w:pPr>
+      <w:r>
+        <w:rPr>
+          <w:rFonts w:ascii="Calibri" w:hAnsi="Calibri" w:cs="Calibri"/>
+          <w:sz w:val="28"/>
+          <w:szCs w:val="28"/>
+        </w:rPr>
+        <w:t xml:space="preserve"> Bhavana </w:t>
+      </w:r>
+      <w:proofErr w:type="spellStart"/>
+      <w:r>
+        <w:rPr>
+          <w:rFonts w:ascii="Calibri" w:hAnsi="Calibri" w:cs="Calibri"/>
+          <w:sz w:val="28"/>
+          <w:szCs w:val="28"/>
+        </w:rPr>
+        <w:t>Manikyanahalli</w:t>
+      </w:r>
+      <w:proofErr w:type="spellEnd"/>
+      <w:r>
+        <w:rPr>
+          <w:rFonts w:ascii="Calibri" w:hAnsi="Calibri" w:cs="Calibri"/>
+          <w:sz w:val="28"/>
+          <w:szCs w:val="28"/>
+        </w:rPr>
+        <w:t xml:space="preserve"> </w:t>
+      </w:r>
+      <w:proofErr w:type="spellStart"/>
+      <w:r>
+        <w:rPr>
+          <w:rFonts w:ascii="Calibri" w:hAnsi="Calibri" w:cs="Calibri"/>
+          <w:sz w:val="28"/>
+          <w:szCs w:val="28"/>
+        </w:rPr>
+        <w:t>Srinivasegowda</w:t>
+      </w:r>
+      <w:proofErr w:type="spellEnd"/>
+    </w:p>
+    <w:p>
+      <w:pPr>
+        <w:spacing w:after="0"/>
+        <w:rPr>
+          <w:rFonts w:ascii="Calibri" w:hAnsi="Calibri" w:cs="Calibri"/>
+          <w:sz w:val="28"/>
+          <w:szCs w:val="28"/>
+        </w:rPr>
+      </w:pPr>
+      <w:r>
+        <w:rPr>
+          <w:rFonts w:ascii="Calibri" w:hAnsi="Calibri" w:cs="Calibri"/>
+          <w:sz w:val="28"/>
+          <w:szCs w:val="28"/>
+        </w:rPr>
+        <w:t xml:space="preserve"> </w:t>
+      </w:r>
+      <w:r>
+        <w:rPr>
+          <w:rFonts w:ascii="Calibri" w:hAnsi="Calibri" w:cs="Calibri"/>
+          <w:sz w:val="28"/>
+          <w:szCs w:val="28"/>
+        </w:rPr>
+        <w:t>Harsha Vardhan Duvvuru</w:t>
+      </w:r>
+    </w:p>
+    <w:p>
+      <w:pPr>
+        <w:spacing w:after="0"/>
+        <w:rPr>
+          <w:rFonts w:ascii="Calibri" w:hAnsi="Calibri" w:cs="Calibri"/>
+          <w:sz w:val="28"/>
+          <w:szCs w:val="28"/>
+        </w:rPr>
+      </w:pPr>
+      <w:r>
+        <w:rPr>
+          <w:rFonts w:ascii="Calibri" w:hAnsi="Calibri" w:cs="Calibri"/>
+          <w:sz w:val="28"/>
+          <w:szCs w:val="28"/>
+        </w:rPr>
+        <w:t xml:space="preserve"> </w:t>
+      </w:r>
+      <w:proofErr w:type="spellStart"/>
+      <w:r>
+        <w:rPr>
+          <w:rFonts w:ascii="Calibri" w:hAnsi="Calibri" w:cs="Calibri"/>
+          <w:sz w:val="28"/>
+          <w:szCs w:val="28"/>
+        </w:rPr>
+        <w:t>Lokarjun</w:t>
+      </w:r>
+      <w:proofErr w:type="spellEnd"/>
+      <w:r>
+        <w:rPr>
+          <w:rFonts w:ascii="Calibri" w:hAnsi="Calibri" w:cs="Calibri"/>
+          <w:sz w:val="28"/>
+          <w:szCs w:val="28"/>
+        </w:rPr>
+        <w:t xml:space="preserve"> Ramesh</w:t>
+      </w:r>
+      <w:r>
+        <w:rPr>
+          <w:rFonts w:ascii="Calibri" w:hAnsi="Calibri" w:cs="Calibri"/>
+          <w:sz w:val="28"/>
+          <w:szCs w:val="28"/>
+        </w:rPr>
+        <w:br/>
+        <w:t>Date:</w:t>
+      </w:r>
+      <w:r>
+        <w:rPr>
+          <w:rFonts w:ascii="Calibri" w:hAnsi="Calibri" w:cs="Calibri"/>
+          <w:sz w:val="28"/>
+          <w:szCs w:val="28"/>
+        </w:rPr>
+        <w:t xml:space="preserve"> 01/31/2025</w:t>
+      </w:r>
+    </w:p>
+    <w:p>
+      <w:pPr>
+        <w:spacing w:after="0"/>
         <w:rPr>
           <w:rFonts w:ascii="Calibri" w:hAnsi="Calibri" w:cs="Calibri"/>
           <w:sz w:val="40"/>
           <w:szCs w:val="40"/>
         </w:rPr>
+      </w:pPr>
+    </w:p>
+    <w:p>
+      <w:pPr>
+        <w:spacing w:after="0"/>
+        <w:rPr>
+          <w:rFonts w:ascii="Calibri" w:hAnsi="Calibri" w:cs="Calibri"/>
+          <w:sz w:val="28"/>
+          <w:szCs w:val="28"/>
+        </w:rPr>
+      </w:pPr>
+      <w:r>
+        <w:rPr>
+          <w:rFonts w:ascii="Calibri" w:hAnsi="Calibri" w:cs="Calibri"/>
+          <w:sz w:val="28"/>
+          <w:szCs w:val="28"/>
+        </w:rPr>
+        <w:t xml:space="preserve">Github Link: </w:t>
+      </w:r>
+      <w:r>
+        <w:rPr>
+          <w:rFonts w:ascii="Calibri" w:hAnsi="Calibri" w:cs="Calibri"/>
+          <w:sz w:val="28"/>
+          <w:szCs w:val="28"/>
+        </w:rPr>
+        <w:t>https://github.com/BhavanaSrinivasegowda/team8_AHB2APB</w:t>
+      </w:r>
+      <w:r>
+        <w:rPr>
+          <w:rFonts w:ascii="Calibri" w:hAnsi="Calibri" w:cs="Calibri"/>
+          <w:sz w:val="28"/>
+          <w:szCs w:val="28"/>
+        </w:rPr>
         <w:br/>
-        <w:t>Members:</w:t>
-      </w:r>
-      <w:r>
-        <w:rPr>
-          <w:rFonts w:ascii="Calibri" w:hAnsi="Calibri" w:cs="Calibri"/>
-          <w:sz w:val="40"/>
-          <w:szCs w:val="40"/>
-        </w:rPr>
-        <w:t xml:space="preserve"> Bhavana </w:t>
-      </w:r>
-      <w:proofErr w:type="spellStart"/>
-      <w:r>
-        <w:rPr>
-          <w:rFonts w:ascii="Calibri" w:hAnsi="Calibri" w:cs="Calibri"/>
-          <w:sz w:val="40"/>
-          <w:szCs w:val="40"/>
-        </w:rPr>
-        <w:t>Manikyanahalli</w:t>
-      </w:r>
-      <w:proofErr w:type="spellEnd"/>
-      <w:r>
-        <w:rPr>
-          <w:rFonts w:ascii="Calibri" w:hAnsi="Calibri" w:cs="Calibri"/>
-          <w:sz w:val="40"/>
-          <w:szCs w:val="40"/>
-        </w:rPr>
-        <w:t xml:space="preserve"> </w:t>
-      </w:r>
-      <w:proofErr w:type="spellStart"/>
-      <w:r>
-        <w:rPr>
-          <w:rFonts w:ascii="Calibri" w:hAnsi="Calibri" w:cs="Calibri"/>
-          <w:sz w:val="40"/>
-          <w:szCs w:val="40"/>
-        </w:rPr>
-        <w:t>Srinivasegowda</w:t>
-      </w:r>
-      <w:proofErr w:type="spellEnd"/>
-    </w:p>
-    <w:p>
-      <w:pPr>
-        <w:spacing w:after="0"/>
-        <w:rPr>
-          <w:rFonts w:ascii="Calibri" w:hAnsi="Calibri" w:cs="Calibri"/>
-          <w:sz w:val="40"/>
-          <w:szCs w:val="40"/>
-        </w:rPr>
-      </w:pPr>
-      <w:r>
-        <w:rPr>
-          <w:rFonts w:ascii="Calibri" w:hAnsi="Calibri" w:cs="Calibri"/>
-          <w:sz w:val="40"/>
-          <w:szCs w:val="40"/>
-        </w:rPr>
-        <w:t xml:space="preserve">                    </w:t>
-      </w:r>
-      <w:r>
-        <w:rPr>
-          <w:rFonts w:ascii="Calibri" w:hAnsi="Calibri" w:cs="Calibri"/>
-          <w:sz w:val="40"/>
-          <w:szCs w:val="40"/>
-        </w:rPr>
-        <w:t xml:space="preserve">Harsha Vardhan </w:t>
-      </w:r>
-      <w:proofErr w:type="spellStart"/>
-      <w:r>
-        <w:rPr>
-          <w:rFonts w:ascii="Calibri" w:hAnsi="Calibri" w:cs="Calibri"/>
-          <w:sz w:val="40"/>
-          <w:szCs w:val="40"/>
-        </w:rPr>
-        <w:t>Duvvuru</w:t>
-      </w:r>
-      <w:proofErr w:type="spellEnd"/>
-    </w:p>
-    <w:p>
-      <w:pPr>
-        <w:spacing w:after="0"/>
-        <w:rPr>
-          <w:rFonts w:ascii="Calibri" w:hAnsi="Calibri" w:cs="Calibri"/>
-          <w:sz w:val="40"/>
-          <w:szCs w:val="40"/>
-        </w:rPr>
-      </w:pPr>
-      <w:r>
-        <w:rPr>
-          <w:rFonts w:ascii="Calibri" w:hAnsi="Calibri" w:cs="Calibri"/>
-          <w:sz w:val="40"/>
-          <w:szCs w:val="40"/>
-        </w:rPr>
-        <w:t xml:space="preserve">                 </w:t>
-      </w:r>
-      <w:r>
-        <w:rPr>
-          <w:rFonts w:ascii="Calibri" w:hAnsi="Calibri" w:cs="Calibri"/>
-          <w:sz w:val="40"/>
-          <w:szCs w:val="40"/>
-        </w:rPr>
-        <w:t xml:space="preserve"> </w:t>
-      </w:r>
-      <w:r>
-        <w:rPr>
-          <w:rFonts w:ascii="Calibri" w:hAnsi="Calibri" w:cs="Calibri"/>
-          <w:sz w:val="40"/>
-          <w:szCs w:val="40"/>
-        </w:rPr>
-        <w:t xml:space="preserve">  </w:t>
-      </w:r>
-      <w:proofErr w:type="spellStart"/>
-      <w:r>
-        <w:rPr>
-          <w:rFonts w:ascii="Calibri" w:hAnsi="Calibri" w:cs="Calibri"/>
-          <w:sz w:val="40"/>
-          <w:szCs w:val="40"/>
-        </w:rPr>
-        <w:t>Lokarjun</w:t>
-      </w:r>
-      <w:proofErr w:type="spellEnd"/>
-      <w:r>
-        <w:rPr>
-          <w:rFonts w:ascii="Calibri" w:hAnsi="Calibri" w:cs="Calibri"/>
-          <w:sz w:val="40"/>
-          <w:szCs w:val="40"/>
-        </w:rPr>
-        <w:t xml:space="preserve"> Ramesh</w:t>
-      </w:r>
-      <w:r>
-        <w:rPr>
-          <w:rFonts w:ascii="Calibri" w:hAnsi="Calibri" w:cs="Calibri"/>
-          <w:sz w:val="40"/>
-          <w:szCs w:val="40"/>
+      </w:r>
+      <w:r>
+        <w:rPr>
+          <w:rFonts w:ascii="Calibri" w:hAnsi="Calibri" w:cs="Calibri"/>
+          <w:sz w:val="28"/>
+          <w:szCs w:val="28"/>
         </w:rPr>
         <w:br/>
-        <w:t>Date:</w:t>
-      </w:r>
-      <w:r>
-        <w:rPr>
-          <w:rFonts w:ascii="Calibri" w:hAnsi="Calibri" w:cs="Calibri"/>
-          <w:sz w:val="40"/>
-          <w:szCs w:val="40"/>
-        </w:rPr>
-        <w:t xml:space="preserve"> 01/31/2025</w:t>
-      </w:r>
-      <w:r>
-        <w:rPr>
-          <w:rFonts w:ascii="Calibri" w:hAnsi="Calibri" w:cs="Calibri"/>
-          <w:sz w:val="40"/>
-          <w:szCs w:val="40"/>
-        </w:rPr>
-        <w:br/>
-      </w:r>
-      <w:r>
-        <w:rPr>
-          <w:rFonts w:ascii="Calibri" w:hAnsi="Calibri" w:cs="Calibri"/>
-          <w:sz w:val="40"/>
-          <w:szCs w:val="40"/>
-        </w:rPr>
-        <w:br/>
-      </w:r>
-      <w:r>
-        <w:rPr>
-          <w:rFonts w:ascii="Calibri" w:hAnsi="Calibri" w:cs="Calibri"/>
-          <w:sz w:val="40"/>
-          <w:szCs w:val="40"/>
+      </w:r>
+      <w:r>
+        <w:rPr>
+          <w:rFonts w:ascii="Calibri" w:hAnsi="Calibri" w:cs="Calibri"/>
+          <w:sz w:val="28"/>
+          <w:szCs w:val="28"/>
         </w:rPr>
         <w:br/>
       </w:r>
@@ -3366,27 +3393,7 @@
         <w:rPr>
           <w:rFonts w:ascii="Calibri" w:hAnsi="Calibri" w:cs="Calibri"/>
         </w:rPr>
-        <w:t xml:space="preserve">The </w:t>
-      </w:r>
-      <w:proofErr w:type="spellStart"/>
-      <w:r>
-        <w:rPr>
-          <w:rFonts w:ascii="Calibri" w:hAnsi="Calibri" w:cs="Calibri"/>
-        </w:rPr>
-        <w:t>AHBtoAPB</w:t>
-      </w:r>
-      <w:proofErr w:type="spellEnd"/>
-      <w:r>
-        <w:rPr>
-          <w:rFonts w:ascii="Calibri" w:hAnsi="Calibri" w:cs="Calibri"/>
-        </w:rPr>
-        <w:t xml:space="preserve"> Bridge is an AHB slave, providing an interface between the high-speed AHB and low-power APB. Read and write transfers on the AHB are converted into equivalent transfers on the APB. As the APB is not pipelined, then wait states are added during transfers to and from the APB when the AHB is required to wait for the APB</w:t>
-      </w:r>
-      <w:r>
-        <w:rPr>
-          <w:rFonts w:ascii="Calibri" w:hAnsi="Calibri" w:cs="Calibri"/>
-        </w:rPr>
-        <w:t>.</w:t>
+        <w:t>The AHBtoAPB Bridge is an AHB slave, providing an interface between the high-speed AHB and low-power APB. Read and write transfers on the AHB are converted into equivalent transfers on the APB. As the APB is not pipelined, then wait states are added during transfers to and from the APB when the AHB is required to wait for the APB.</w:t>
       </w:r>
     </w:p>
     <w:p>
@@ -3433,21 +3440,7 @@
         <w:rPr>
           <w:rFonts w:ascii="Calibri" w:hAnsi="Calibri" w:cs="Calibri"/>
         </w:rPr>
-        <w:t xml:space="preserve">Decodes the address and generates a peripheral select, </w:t>
-      </w:r>
-      <w:proofErr w:type="spellStart"/>
-      <w:r>
-        <w:rPr>
-          <w:rFonts w:ascii="Calibri" w:hAnsi="Calibri" w:cs="Calibri"/>
-        </w:rPr>
-        <w:t>PSELx</w:t>
-      </w:r>
-      <w:proofErr w:type="spellEnd"/>
-      <w:r>
-        <w:rPr>
-          <w:rFonts w:ascii="Calibri" w:hAnsi="Calibri" w:cs="Calibri"/>
-        </w:rPr>
-        <w:t>. Only one select signal can be active during a transfer.</w:t>
+        <w:t>Decodes the address and generates a peripheral select, PSELx. Only one select signal can be active during a transfer.</w:t>
       </w:r>
     </w:p>
     <w:p>
@@ -3829,13 +3822,7 @@
         <w:rPr>
           <w:rFonts w:ascii="Calibri" w:hAnsi="Calibri" w:cs="Calibri"/>
         </w:rPr>
-        <w:t>Specifications</w:t>
-      </w:r>
-      <w:r>
-        <w:rPr>
-          <w:rFonts w:ascii="Calibri" w:hAnsi="Calibri" w:cs="Calibri"/>
-        </w:rPr>
-        <w:t xml:space="preserve"> to be implemented in milestone-1:</w:t>
+        <w:t>Specifications to be implemented in milestone-1:</w:t>
       </w:r>
     </w:p>
     <w:tbl>
@@ -4107,13 +4094,7 @@
         <w:rPr>
           <w:rFonts w:ascii="Calibri" w:hAnsi="Calibri" w:cs="Calibri"/>
         </w:rPr>
-        <w:t>Specifications</w:t>
-      </w:r>
-      <w:r>
-        <w:rPr>
-          <w:rFonts w:ascii="Calibri" w:hAnsi="Calibri" w:cs="Calibri"/>
-        </w:rPr>
-        <w:t xml:space="preserve"> to be implemented in future milestones:</w:t>
+        <w:t>Specifications to be implemented in future milestones:</w:t>
       </w:r>
     </w:p>
     <w:tbl>
@@ -4455,7 +4436,6 @@
           <w:szCs w:val="22"/>
         </w:rPr>
       </w:pPr>
-      <w:proofErr w:type="spellStart"/>
       <w:r>
         <w:rPr>
           <w:rFonts w:ascii="Calibri" w:hAnsi="Calibri" w:cs="Calibri"/>
@@ -4464,44 +4444,15 @@
           <w:sz w:val="22"/>
           <w:szCs w:val="22"/>
         </w:rPr>
-        <w:t>AHB_slave_interface</w:t>
-      </w:r>
-      <w:proofErr w:type="spellEnd"/>
-      <w:r>
-        <w:rPr>
-          <w:rFonts w:ascii="Calibri" w:hAnsi="Calibri" w:cs="Calibri"/>
-          <w:b/>
-          <w:bCs/>
+        <w:t>AHB_slave_interface:</w:t>
+      </w:r>
+      <w:r>
+        <w:rPr>
+          <w:rFonts w:ascii="Calibri" w:hAnsi="Calibri" w:cs="Calibri"/>
           <w:sz w:val="22"/>
           <w:szCs w:val="22"/>
         </w:rPr>
-        <w:t>:</w:t>
-      </w:r>
-      <w:r>
-        <w:rPr>
-          <w:rFonts w:ascii="Calibri" w:hAnsi="Calibri" w:cs="Calibri"/>
-          <w:sz w:val="22"/>
-          <w:szCs w:val="22"/>
-        </w:rPr>
-        <w:t xml:space="preserve"> This module handles the interface with the AHB bus. It implements pipeline logic for address, data, and control signals. It also generates valid logic and implements </w:t>
-      </w:r>
-      <w:proofErr w:type="spellStart"/>
-      <w:r>
-        <w:rPr>
-          <w:rFonts w:ascii="Calibri" w:hAnsi="Calibri" w:cs="Calibri"/>
-          <w:sz w:val="22"/>
-          <w:szCs w:val="22"/>
-        </w:rPr>
-        <w:t>tempselx</w:t>
-      </w:r>
-      <w:proofErr w:type="spellEnd"/>
-      <w:r>
-        <w:rPr>
-          <w:rFonts w:ascii="Calibri" w:hAnsi="Calibri" w:cs="Calibri"/>
-          <w:sz w:val="22"/>
-          <w:szCs w:val="22"/>
-        </w:rPr>
-        <w:t xml:space="preserve"> logic. The complexity of this module is moderate due to the pipelining and logic generation involved.</w:t>
+        <w:t xml:space="preserve"> This module handles the interface with the AHB bus. It implements pipeline logic for address, data, and control signals. It also generates valid logic and implements tempselx logic. The complexity of this module is moderate due to the pipelining and logic generation involved.</w:t>
       </w:r>
     </w:p>
     <w:p>
@@ -4518,7 +4469,6 @@
           <w:szCs w:val="22"/>
         </w:rPr>
       </w:pPr>
-      <w:proofErr w:type="spellStart"/>
       <w:r>
         <w:rPr>
           <w:rFonts w:ascii="Calibri" w:hAnsi="Calibri" w:cs="Calibri"/>
@@ -4527,18 +4477,7 @@
           <w:sz w:val="22"/>
           <w:szCs w:val="22"/>
         </w:rPr>
-        <w:t>APB_FSM_Controller</w:t>
-      </w:r>
-      <w:proofErr w:type="spellEnd"/>
-      <w:r>
-        <w:rPr>
-          <w:rFonts w:ascii="Calibri" w:hAnsi="Calibri" w:cs="Calibri"/>
-          <w:b/>
-          <w:bCs/>
-          <w:sz w:val="22"/>
-          <w:szCs w:val="22"/>
-        </w:rPr>
-        <w:t>:</w:t>
+        <w:t>APB_FSM_Controller:</w:t>
       </w:r>
       <w:r>
         <w:rPr>
@@ -4563,7 +4502,6 @@
           <w:szCs w:val="22"/>
         </w:rPr>
       </w:pPr>
-      <w:proofErr w:type="spellStart"/>
       <w:r>
         <w:rPr>
           <w:rFonts w:ascii="Calibri" w:hAnsi="Calibri" w:cs="Calibri"/>
@@ -4572,18 +4510,7 @@
           <w:sz w:val="22"/>
           <w:szCs w:val="22"/>
         </w:rPr>
-        <w:t>APB_Interface</w:t>
-      </w:r>
-      <w:proofErr w:type="spellEnd"/>
-      <w:r>
-        <w:rPr>
-          <w:rFonts w:ascii="Calibri" w:hAnsi="Calibri" w:cs="Calibri"/>
-          <w:b/>
-          <w:bCs/>
-          <w:sz w:val="22"/>
-          <w:szCs w:val="22"/>
-        </w:rPr>
-        <w:t>:</w:t>
+        <w:t>APB_Interface:</w:t>
       </w:r>
       <w:r>
         <w:rPr>
@@ -4608,7 +4535,6 @@
           <w:szCs w:val="22"/>
         </w:rPr>
       </w:pPr>
-      <w:proofErr w:type="spellStart"/>
       <w:r>
         <w:rPr>
           <w:rFonts w:ascii="Calibri" w:hAnsi="Calibri" w:cs="Calibri"/>
@@ -4617,62 +4543,15 @@
           <w:sz w:val="22"/>
           <w:szCs w:val="22"/>
         </w:rPr>
-        <w:t>Bridge_Top</w:t>
-      </w:r>
-      <w:proofErr w:type="spellEnd"/>
-      <w:r>
-        <w:rPr>
-          <w:rFonts w:ascii="Calibri" w:hAnsi="Calibri" w:cs="Calibri"/>
-          <w:b/>
-          <w:bCs/>
+        <w:t>Bridge_Top:</w:t>
+      </w:r>
+      <w:r>
+        <w:rPr>
+          <w:rFonts w:ascii="Calibri" w:hAnsi="Calibri" w:cs="Calibri"/>
           <w:sz w:val="22"/>
           <w:szCs w:val="22"/>
         </w:rPr>
-        <w:t>:</w:t>
-      </w:r>
-      <w:r>
-        <w:rPr>
-          <w:rFonts w:ascii="Calibri" w:hAnsi="Calibri" w:cs="Calibri"/>
-          <w:sz w:val="22"/>
-          <w:szCs w:val="22"/>
-        </w:rPr>
-        <w:t xml:space="preserve"> This module is the top-level module that instantiates the </w:t>
-      </w:r>
-      <w:proofErr w:type="spellStart"/>
-      <w:r>
-        <w:rPr>
-          <w:rFonts w:ascii="Calibri" w:hAnsi="Calibri" w:cs="Calibri"/>
-          <w:sz w:val="22"/>
-          <w:szCs w:val="22"/>
-        </w:rPr>
-        <w:t>AHB_slave_interface</w:t>
-      </w:r>
-      <w:proofErr w:type="spellEnd"/>
-      <w:r>
-        <w:rPr>
-          <w:rFonts w:ascii="Calibri" w:hAnsi="Calibri" w:cs="Calibri"/>
-          <w:sz w:val="22"/>
-          <w:szCs w:val="22"/>
-        </w:rPr>
-        <w:t xml:space="preserve"> and </w:t>
-      </w:r>
-      <w:proofErr w:type="spellStart"/>
-      <w:r>
-        <w:rPr>
-          <w:rFonts w:ascii="Calibri" w:hAnsi="Calibri" w:cs="Calibri"/>
-          <w:sz w:val="22"/>
-          <w:szCs w:val="22"/>
-        </w:rPr>
-        <w:t>APB_FSM_Controller</w:t>
-      </w:r>
-      <w:proofErr w:type="spellEnd"/>
-      <w:r>
-        <w:rPr>
-          <w:rFonts w:ascii="Calibri" w:hAnsi="Calibri" w:cs="Calibri"/>
-          <w:sz w:val="22"/>
-          <w:szCs w:val="22"/>
-        </w:rPr>
-        <w:t>. The complexity of this module is low as it primarily serves as a structural component to connect the other modules.</w:t>
+        <w:t xml:space="preserve"> This module is the top-level module that instantiates the AHB_slave_interface and APB_FSM_Controller. The complexity of this module is low as it primarily serves as a structural component to connect the other modules.</w:t>
       </w:r>
     </w:p>
     <w:p>
@@ -4730,25 +4609,7 @@
           <w:sz w:val="22"/>
           <w:szCs w:val="22"/>
         </w:rPr>
-        <w:t xml:space="preserve">The specification of the design is clear, with each module's functionality and interaction with other modules well-defined. The FSM in the </w:t>
-      </w:r>
-      <w:proofErr w:type="spellStart"/>
-      <w:r>
-        <w:rPr>
-          <w:rFonts w:ascii="Calibri" w:hAnsi="Calibri" w:cs="Calibri"/>
-          <w:sz w:val="22"/>
-          <w:szCs w:val="22"/>
-        </w:rPr>
-        <w:t>APB_FSM_Controller</w:t>
-      </w:r>
-      <w:proofErr w:type="spellEnd"/>
-      <w:r>
-        <w:rPr>
-          <w:rFonts w:ascii="Calibri" w:hAnsi="Calibri" w:cs="Calibri"/>
-          <w:sz w:val="22"/>
-          <w:szCs w:val="22"/>
-        </w:rPr>
-        <w:t xml:space="preserve"> is particularly well-specified, with clear states and transitions.</w:t>
+        <w:t>The specification of the design is clear, with each module's functionality and interaction with other modules well-defined. The FSM in the APB_FSM_Controller is particularly well-specified, with clear states and transitions.</w:t>
       </w:r>
     </w:p>
     <w:p>
@@ -4777,12 +4638,13 @@
       <w:r>
         <w:rPr>
           <w:rFonts w:ascii="Calibri" w:hAnsi="Calibri" w:cs="Calibri"/>
+          <w:noProof/>
           <w:sz w:val="22"/>
           <w:szCs w:val="22"/>
           <w:lang w:val="en-IN"/>
         </w:rPr>
         <w:drawing>
-          <wp:anchor distT="0" distB="0" distL="114300" distR="114300" simplePos="0" relativeHeight="251666432" behindDoc="1" locked="0" layoutInCell="1" allowOverlap="1" wp14:anchorId="4A5C3E3B" wp14:editId="1F98F22F">
+          <wp:anchor distT="0" distB="0" distL="114300" distR="114300" simplePos="0" relativeHeight="251666432" behindDoc="1" locked="0" layoutInCell="1" allowOverlap="1" wp14:anchorId="4A5C3E3B" wp14:editId="7CD76E12">
             <wp:simplePos x="0" y="0"/>
             <wp:positionH relativeFrom="column">
               <wp:posOffset>850900</wp:posOffset>
@@ -5110,9 +4972,8 @@
           <w:szCs w:val="22"/>
           <w:lang w:val="en-IN" w:eastAsia="en-IN"/>
         </w:rPr>
-        <w:t xml:space="preserve">The </w:t>
-      </w:r>
-      <w:proofErr w:type="spellStart"/>
+        <w:t>The QuestaSim simulator will be utilized for simulation and coverage analysis.</w:t>
+      </w:r>
       <w:r>
         <w:rPr>
           <w:rFonts w:ascii="Calibri" w:eastAsia="Times New Roman" w:hAnsi="Calibri" w:cs="Calibri"/>
@@ -5120,68 +4981,13 @@
           <w:szCs w:val="22"/>
           <w:lang w:val="en-IN" w:eastAsia="en-IN"/>
         </w:rPr>
-        <w:t>QuestaSim</w:t>
-      </w:r>
-      <w:proofErr w:type="spellEnd"/>
-      <w:r>
-        <w:rPr>
-          <w:rFonts w:ascii="Calibri" w:eastAsia="Times New Roman" w:hAnsi="Calibri" w:cs="Calibri"/>
-          <w:sz w:val="22"/>
-          <w:szCs w:val="22"/>
-          <w:lang w:val="en-IN" w:eastAsia="en-IN"/>
-        </w:rPr>
-        <w:t xml:space="preserve"> simulator will be utilized for simulation and coverage analysis.</w:t>
-      </w:r>
-      <w:r>
-        <w:rPr>
-          <w:rFonts w:ascii="Calibri" w:eastAsia="Times New Roman" w:hAnsi="Calibri" w:cs="Calibri"/>
-          <w:sz w:val="22"/>
-          <w:szCs w:val="22"/>
-          <w:lang w:val="en-IN" w:eastAsia="en-IN"/>
-        </w:rPr>
         <w:t xml:space="preserve"> </w:t>
       </w:r>
-      <w:proofErr w:type="spellStart"/>
-      <w:r>
-        <w:rPr>
-          <w:rFonts w:ascii="Calibri" w:hAnsi="Calibri" w:cs="Calibri"/>
-        </w:rPr>
-        <w:t>QuestaSim</w:t>
-      </w:r>
-      <w:proofErr w:type="spellEnd"/>
-      <w:r>
-        <w:rPr>
-          <w:rFonts w:ascii="Calibri" w:hAnsi="Calibri" w:cs="Calibri"/>
-        </w:rPr>
-        <w:t xml:space="preserve"> is a comprehensive tool that supports advanced verification methodologies and provides extensive debugging features. It supports both VHDL and Verilog languages, which makes it suitable for our project as we are using </w:t>
-      </w:r>
-      <w:proofErr w:type="spellStart"/>
-      <w:r>
-        <w:rPr>
-          <w:rFonts w:ascii="Calibri" w:hAnsi="Calibri" w:cs="Calibri"/>
-        </w:rPr>
-        <w:t>SystemVerilog</w:t>
-      </w:r>
-      <w:proofErr w:type="spellEnd"/>
-      <w:r>
-        <w:rPr>
-          <w:rFonts w:ascii="Calibri" w:hAnsi="Calibri" w:cs="Calibri"/>
-        </w:rPr>
-        <w:t xml:space="preserve"> for our design. </w:t>
-      </w:r>
-      <w:proofErr w:type="spellStart"/>
-      <w:r>
-        <w:rPr>
-          <w:rFonts w:ascii="Calibri" w:hAnsi="Calibri" w:cs="Calibri"/>
-        </w:rPr>
-        <w:t>QuestaSim</w:t>
-      </w:r>
-      <w:proofErr w:type="spellEnd"/>
-      <w:r>
-        <w:rPr>
-          <w:rFonts w:ascii="Calibri" w:hAnsi="Calibri" w:cs="Calibri"/>
-        </w:rPr>
-        <w:t xml:space="preserve"> will be used to run the simulations of our testbenches against the RTL design.</w:t>
+      <w:r>
+        <w:rPr>
+          <w:rFonts w:ascii="Calibri" w:hAnsi="Calibri" w:cs="Calibri"/>
+        </w:rPr>
+        <w:t>QuestaSim is a comprehensive tool that supports advanced verification methodologies and provides extensive debugging features. It supports both VHDL and Verilog languages, which makes it suitable for our project as we are using SystemVerilog for our design. QuestaSim will be used to run the simulations of our testbenches against the RTL design.</w:t>
       </w:r>
     </w:p>
     <w:p>
@@ -5195,7 +5001,6 @@
           <w:rFonts w:ascii="Calibri" w:hAnsi="Calibri" w:cs="Calibri"/>
         </w:rPr>
       </w:pPr>
-      <w:proofErr w:type="spellStart"/>
       <w:r>
         <w:rPr>
           <w:rFonts w:ascii="Calibri" w:eastAsia="Times New Roman" w:hAnsi="Calibri" w:cs="Calibri"/>
@@ -5203,9 +5008,8 @@
           <w:szCs w:val="22"/>
           <w:lang w:val="en-IN" w:eastAsia="en-IN"/>
         </w:rPr>
-        <w:t>SystemVerilog</w:t>
-      </w:r>
-      <w:proofErr w:type="spellEnd"/>
+        <w:t>SystemVerilog (SV) and SystemVerilog Assertions (SVA) will be used to develop the testbench.</w:t>
+      </w:r>
       <w:r>
         <w:rPr>
           <w:rFonts w:ascii="Calibri" w:eastAsia="Times New Roman" w:hAnsi="Calibri" w:cs="Calibri"/>
@@ -5213,38 +5017,8 @@
           <w:szCs w:val="22"/>
           <w:lang w:val="en-IN" w:eastAsia="en-IN"/>
         </w:rPr>
-        <w:t xml:space="preserve"> (SV) and </w:t>
-      </w:r>
-      <w:proofErr w:type="spellStart"/>
-      <w:r>
-        <w:rPr>
-          <w:rFonts w:ascii="Calibri" w:eastAsia="Times New Roman" w:hAnsi="Calibri" w:cs="Calibri"/>
-          <w:sz w:val="22"/>
-          <w:szCs w:val="22"/>
-          <w:lang w:val="en-IN" w:eastAsia="en-IN"/>
-        </w:rPr>
-        <w:t>SystemVerilog</w:t>
-      </w:r>
-      <w:proofErr w:type="spellEnd"/>
-      <w:r>
-        <w:rPr>
-          <w:rFonts w:ascii="Calibri" w:eastAsia="Times New Roman" w:hAnsi="Calibri" w:cs="Calibri"/>
-          <w:sz w:val="22"/>
-          <w:szCs w:val="22"/>
-          <w:lang w:val="en-IN" w:eastAsia="en-IN"/>
-        </w:rPr>
-        <w:t xml:space="preserve"> Assertions (SVA) will be used to develop the testbench.</w:t>
-      </w:r>
-      <w:r>
-        <w:rPr>
-          <w:rFonts w:ascii="Calibri" w:eastAsia="Times New Roman" w:hAnsi="Calibri" w:cs="Calibri"/>
-          <w:sz w:val="22"/>
-          <w:szCs w:val="22"/>
-          <w:lang w:val="en-IN" w:eastAsia="en-IN"/>
-        </w:rPr>
         <w:t xml:space="preserve"> </w:t>
       </w:r>
-      <w:proofErr w:type="spellStart"/>
       <w:r>
         <w:rPr>
           <w:rFonts w:ascii="Calibri" w:eastAsia="Times New Roman" w:hAnsi="Calibri" w:cs="Calibri"/>
@@ -5252,37 +5026,7 @@
           <w:szCs w:val="22"/>
           <w:lang w:eastAsia="en-IN"/>
         </w:rPr>
-        <w:t>SystemVerilog</w:t>
-      </w:r>
-      <w:proofErr w:type="spellEnd"/>
-      <w:r>
-        <w:rPr>
-          <w:rFonts w:ascii="Calibri" w:eastAsia="Times New Roman" w:hAnsi="Calibri" w:cs="Calibri"/>
-          <w:sz w:val="22"/>
-          <w:szCs w:val="22"/>
-          <w:lang w:eastAsia="en-IN"/>
-        </w:rPr>
-        <w:t xml:space="preserve"> is a hardware description and hardware verification language used to model, design, and verify electronic systems. It extends the Verilog hardware description language with powerful verification features. We will use </w:t>
-      </w:r>
-      <w:proofErr w:type="spellStart"/>
-      <w:r>
-        <w:rPr>
-          <w:rFonts w:ascii="Calibri" w:eastAsia="Times New Roman" w:hAnsi="Calibri" w:cs="Calibri"/>
-          <w:sz w:val="22"/>
-          <w:szCs w:val="22"/>
-          <w:lang w:eastAsia="en-IN"/>
-        </w:rPr>
-        <w:t>SystemVerilog</w:t>
-      </w:r>
-      <w:proofErr w:type="spellEnd"/>
-      <w:r>
-        <w:rPr>
-          <w:rFonts w:ascii="Calibri" w:eastAsia="Times New Roman" w:hAnsi="Calibri" w:cs="Calibri"/>
-          <w:sz w:val="22"/>
-          <w:szCs w:val="22"/>
-          <w:lang w:eastAsia="en-IN"/>
-        </w:rPr>
-        <w:t xml:space="preserve"> to write our testbenches due to its advanced verification capabilities, such as classes, randomization, and functional coverage, which will help us create robust and comprehensive tests for our design.</w:t>
+        <w:t>SystemVerilog is a hardware description and hardware verification language used to model, design, and verify electronic systems. It extends the Verilog hardware description language with powerful verification features. We will use SystemVerilog to write our testbenches due to its advanced verification capabilities, such as classes, randomization, and functional coverage, which will help us create robust and comprehensive tests for our design.</w:t>
       </w:r>
     </w:p>
     <w:p>
@@ -5362,27 +5106,7 @@
           <w:szCs w:val="24"/>
           <w:lang w:val="en-IN" w:eastAsia="en-IN"/>
         </w:rPr>
-        <w:t xml:space="preserve">Dependencies involve the availability of the </w:t>
-      </w:r>
-      <w:proofErr w:type="spellStart"/>
-      <w:r>
-        <w:rPr>
-          <w:rFonts w:ascii="Calibri" w:eastAsia="Times New Roman" w:hAnsi="Calibri" w:cs="Calibri"/>
-          <w:sz w:val="24"/>
-          <w:szCs w:val="24"/>
-          <w:lang w:val="en-IN" w:eastAsia="en-IN"/>
-        </w:rPr>
-        <w:t>QuestaSim</w:t>
-      </w:r>
-      <w:proofErr w:type="spellEnd"/>
-      <w:r>
-        <w:rPr>
-          <w:rFonts w:ascii="Calibri" w:eastAsia="Times New Roman" w:hAnsi="Calibri" w:cs="Calibri"/>
-          <w:sz w:val="24"/>
-          <w:szCs w:val="24"/>
-          <w:lang w:val="en-IN" w:eastAsia="en-IN"/>
-        </w:rPr>
-        <w:t xml:space="preserve"> simulator and its license.</w:t>
+        <w:t>Dependencies involve the availability of the QuestaSim simulator and its license.</w:t>
       </w:r>
     </w:p>
     <w:p>
@@ -5739,17 +5463,9 @@
         <w:rPr>
           <w:rFonts w:ascii="Calibri" w:hAnsi="Calibri" w:cs="Calibri"/>
         </w:rPr>
-        <w:t xml:space="preserve">List of critical functions and non-critical functions for </w:t>
-      </w:r>
-      <w:proofErr w:type="spellStart"/>
-      <w:r>
-        <w:rPr>
-          <w:rFonts w:ascii="Calibri" w:hAnsi="Calibri" w:cs="Calibri"/>
-        </w:rPr>
-        <w:t>tapeout</w:t>
+        <w:t>List of critical functions and non-critical functions for tapeout</w:t>
       </w:r>
       <w:bookmarkEnd w:id="16"/>
-      <w:proofErr w:type="spellEnd"/>
     </w:p>
     <w:p>
       <w:pPr>
@@ -6688,41 +6404,18 @@
           <w:rFonts w:ascii="Calibri" w:hAnsi="Calibri" w:cs="Calibri"/>
         </w:rPr>
       </w:pPr>
-      <w:proofErr w:type="spellStart"/>
       <w:r>
         <w:rPr>
           <w:rStyle w:val="Strong"/>
           <w:rFonts w:ascii="Calibri" w:hAnsi="Calibri" w:cs="Calibri"/>
         </w:rPr>
-        <w:t>AHB_slave_interface</w:t>
-      </w:r>
-      <w:proofErr w:type="spellEnd"/>
-      <w:r>
-        <w:rPr>
-          <w:rStyle w:val="Strong"/>
-          <w:rFonts w:ascii="Calibri" w:hAnsi="Calibri" w:cs="Calibri"/>
-        </w:rPr>
-        <w:t>:</w:t>
-      </w:r>
-      <w:r>
-        <w:rPr>
-          <w:rFonts w:ascii="Calibri" w:hAnsi="Calibri" w:cs="Calibri"/>
-        </w:rPr>
-        <w:t xml:space="preserve"> We will provide inputs like the AHB bus signals and verify outputs such as the valid signal and the </w:t>
-      </w:r>
-      <w:proofErr w:type="spellStart"/>
-      <w:r>
-        <w:rPr>
-          <w:rFonts w:ascii="Calibri" w:hAnsi="Calibri" w:cs="Calibri"/>
-        </w:rPr>
-        <w:t>tempselx</w:t>
-      </w:r>
-      <w:proofErr w:type="spellEnd"/>
-      <w:r>
-        <w:rPr>
-          <w:rFonts w:ascii="Calibri" w:hAnsi="Calibri" w:cs="Calibri"/>
-        </w:rPr>
-        <w:t xml:space="preserve"> logic. Additionally, we will check the pipelining of address, data, and control signals.</w:t>
+        <w:t>AHB_slave_interface:</w:t>
+      </w:r>
+      <w:r>
+        <w:rPr>
+          <w:rFonts w:ascii="Calibri" w:hAnsi="Calibri" w:cs="Calibri"/>
+        </w:rPr>
+        <w:t xml:space="preserve"> We will provide inputs like the AHB bus signals and verify outputs such as the valid signal and the tempselx logic. Additionally, we will check the pipelining of address, data, and control signals.</w:t>
       </w:r>
     </w:p>
     <w:p>
@@ -6736,55 +6429,18 @@
           <w:rFonts w:ascii="Calibri" w:hAnsi="Calibri" w:cs="Calibri"/>
         </w:rPr>
       </w:pPr>
-      <w:proofErr w:type="spellStart"/>
       <w:r>
         <w:rPr>
           <w:rStyle w:val="Strong"/>
           <w:rFonts w:ascii="Calibri" w:hAnsi="Calibri" w:cs="Calibri"/>
         </w:rPr>
-        <w:t>APB_FSM_Controller</w:t>
-      </w:r>
-      <w:proofErr w:type="spellEnd"/>
-      <w:r>
-        <w:rPr>
-          <w:rStyle w:val="Strong"/>
-          <w:rFonts w:ascii="Calibri" w:hAnsi="Calibri" w:cs="Calibri"/>
-        </w:rPr>
-        <w:t>:</w:t>
-      </w:r>
-      <w:r>
-        <w:rPr>
-          <w:rFonts w:ascii="Calibri" w:hAnsi="Calibri" w:cs="Calibri"/>
-        </w:rPr>
-        <w:t xml:space="preserve"> We will supply inputs like the valid signal, </w:t>
-      </w:r>
-      <w:proofErr w:type="spellStart"/>
-      <w:r>
-        <w:rPr>
-          <w:rFonts w:ascii="Calibri" w:hAnsi="Calibri" w:cs="Calibri"/>
-        </w:rPr>
-        <w:t>Hwrite</w:t>
-      </w:r>
-      <w:proofErr w:type="spellEnd"/>
-      <w:r>
-        <w:rPr>
-          <w:rFonts w:ascii="Calibri" w:hAnsi="Calibri" w:cs="Calibri"/>
-        </w:rPr>
-        <w:t xml:space="preserve"> signal, and </w:t>
-      </w:r>
-      <w:proofErr w:type="spellStart"/>
-      <w:r>
-        <w:rPr>
-          <w:rFonts w:ascii="Calibri" w:hAnsi="Calibri" w:cs="Calibri"/>
-        </w:rPr>
-        <w:t>Hwritereg</w:t>
-      </w:r>
-      <w:proofErr w:type="spellEnd"/>
-      <w:r>
-        <w:rPr>
-          <w:rFonts w:ascii="Calibri" w:hAnsi="Calibri" w:cs="Calibri"/>
-        </w:rPr>
-        <w:t xml:space="preserve"> signal, and check the FSM state transitions. We will also verify the output signals that control the APB bus.</w:t>
+        <w:t>APB_FSM_Controller:</w:t>
+      </w:r>
+      <w:r>
+        <w:rPr>
+          <w:rFonts w:ascii="Calibri" w:hAnsi="Calibri" w:cs="Calibri"/>
+        </w:rPr>
+        <w:t xml:space="preserve"> We will supply inputs like the valid signal, Hwrite signal, and Hwritereg signal, and check the FSM state transitions. We will also verify the output signals that control the APB bus.</w:t>
       </w:r>
     </w:p>
     <w:p>
@@ -6798,83 +6454,18 @@
           <w:rFonts w:ascii="Calibri" w:hAnsi="Calibri" w:cs="Calibri"/>
         </w:rPr>
       </w:pPr>
-      <w:proofErr w:type="spellStart"/>
       <w:r>
         <w:rPr>
           <w:rStyle w:val="Strong"/>
           <w:rFonts w:ascii="Calibri" w:hAnsi="Calibri" w:cs="Calibri"/>
         </w:rPr>
-        <w:t>APB_Interface</w:t>
-      </w:r>
-      <w:proofErr w:type="spellEnd"/>
-      <w:r>
-        <w:rPr>
-          <w:rStyle w:val="Strong"/>
-          <w:rFonts w:ascii="Calibri" w:hAnsi="Calibri" w:cs="Calibri"/>
-        </w:rPr>
-        <w:t>:</w:t>
-      </w:r>
-      <w:r>
-        <w:rPr>
-          <w:rFonts w:ascii="Calibri" w:hAnsi="Calibri" w:cs="Calibri"/>
-        </w:rPr>
-        <w:t xml:space="preserve"> We will apply inputs such as the </w:t>
-      </w:r>
-      <w:proofErr w:type="spellStart"/>
-      <w:r>
-        <w:rPr>
-          <w:rFonts w:ascii="Calibri" w:hAnsi="Calibri" w:cs="Calibri"/>
-        </w:rPr>
-        <w:t>Pwrite</w:t>
-      </w:r>
-      <w:proofErr w:type="spellEnd"/>
-      <w:r>
-        <w:rPr>
-          <w:rFonts w:ascii="Calibri" w:hAnsi="Calibri" w:cs="Calibri"/>
-        </w:rPr>
-        <w:t xml:space="preserve"> signal and the </w:t>
-      </w:r>
-      <w:proofErr w:type="spellStart"/>
-      <w:r>
-        <w:rPr>
-          <w:rFonts w:ascii="Calibri" w:hAnsi="Calibri" w:cs="Calibri"/>
-        </w:rPr>
-        <w:t>Penable</w:t>
-      </w:r>
-      <w:proofErr w:type="spellEnd"/>
-      <w:r>
-        <w:rPr>
-          <w:rFonts w:ascii="Calibri" w:hAnsi="Calibri" w:cs="Calibri"/>
-        </w:rPr>
-        <w:t xml:space="preserve"> signal, and verify outputs like the </w:t>
-      </w:r>
-      <w:proofErr w:type="spellStart"/>
-      <w:r>
-        <w:rPr>
-          <w:rFonts w:ascii="Calibri" w:hAnsi="Calibri" w:cs="Calibri"/>
-        </w:rPr>
-        <w:t>Prdata</w:t>
-      </w:r>
-      <w:proofErr w:type="spellEnd"/>
-      <w:r>
-        <w:rPr>
-          <w:rFonts w:ascii="Calibri" w:hAnsi="Calibri" w:cs="Calibri"/>
-        </w:rPr>
-        <w:t xml:space="preserve"> signal and the </w:t>
-      </w:r>
-      <w:proofErr w:type="spellStart"/>
-      <w:r>
-        <w:rPr>
-          <w:rFonts w:ascii="Calibri" w:hAnsi="Calibri" w:cs="Calibri"/>
-        </w:rPr>
-        <w:t>Pready</w:t>
-      </w:r>
-      <w:proofErr w:type="spellEnd"/>
-      <w:r>
-        <w:rPr>
-          <w:rFonts w:ascii="Calibri" w:hAnsi="Calibri" w:cs="Calibri"/>
-        </w:rPr>
-        <w:t xml:space="preserve"> signal.</w:t>
+        <w:t>APB_Interface:</w:t>
+      </w:r>
+      <w:r>
+        <w:rPr>
+          <w:rFonts w:ascii="Calibri" w:hAnsi="Calibri" w:cs="Calibri"/>
+        </w:rPr>
+        <w:t xml:space="preserve"> We will apply inputs such as the Pwrite signal and the Penable signal, and verify outputs like the Prdata signal and the Pready signal.</w:t>
       </w:r>
     </w:p>
     <w:p>
@@ -6888,55 +6479,18 @@
           <w:rFonts w:ascii="Calibri" w:hAnsi="Calibri" w:cs="Calibri"/>
         </w:rPr>
       </w:pPr>
-      <w:proofErr w:type="spellStart"/>
       <w:r>
         <w:rPr>
           <w:rStyle w:val="Strong"/>
           <w:rFonts w:ascii="Calibri" w:hAnsi="Calibri" w:cs="Calibri"/>
         </w:rPr>
-        <w:t>Bridge_Top</w:t>
-      </w:r>
-      <w:proofErr w:type="spellEnd"/>
-      <w:r>
-        <w:rPr>
-          <w:rStyle w:val="Strong"/>
-          <w:rFonts w:ascii="Calibri" w:hAnsi="Calibri" w:cs="Calibri"/>
-        </w:rPr>
-        <w:t>:</w:t>
-      </w:r>
-      <w:r>
-        <w:rPr>
-          <w:rFonts w:ascii="Calibri" w:hAnsi="Calibri" w:cs="Calibri"/>
-        </w:rPr>
-        <w:t xml:space="preserve"> We will drive inputs to both the </w:t>
-      </w:r>
-      <w:proofErr w:type="spellStart"/>
-      <w:r>
-        <w:rPr>
-          <w:rFonts w:ascii="Calibri" w:hAnsi="Calibri" w:cs="Calibri"/>
-        </w:rPr>
-        <w:t>AHB_slave_interface</w:t>
-      </w:r>
-      <w:proofErr w:type="spellEnd"/>
-      <w:r>
-        <w:rPr>
-          <w:rFonts w:ascii="Calibri" w:hAnsi="Calibri" w:cs="Calibri"/>
-        </w:rPr>
-        <w:t xml:space="preserve"> and the </w:t>
-      </w:r>
-      <w:proofErr w:type="spellStart"/>
-      <w:r>
-        <w:rPr>
-          <w:rFonts w:ascii="Calibri" w:hAnsi="Calibri" w:cs="Calibri"/>
-        </w:rPr>
-        <w:t>APB_FSM_Controller</w:t>
-      </w:r>
-      <w:proofErr w:type="spellEnd"/>
-      <w:r>
-        <w:rPr>
-          <w:rFonts w:ascii="Calibri" w:hAnsi="Calibri" w:cs="Calibri"/>
-        </w:rPr>
-        <w:t>, and check the outputs from these modules to ensure proper interaction.</w:t>
+        <w:t>Bridge_Top:</w:t>
+      </w:r>
+      <w:r>
+        <w:rPr>
+          <w:rFonts w:ascii="Calibri" w:hAnsi="Calibri" w:cs="Calibri"/>
+        </w:rPr>
+        <w:t xml:space="preserve"> We will drive inputs to both the AHB_slave_interface and the APB_FSM_Controller, and check the outputs from these modules to ensure proper interaction.</w:t>
       </w:r>
     </w:p>
     <w:p>
@@ -7119,23 +6673,7 @@
           <w:lang w:val="en-IN"/>
         </w:rPr>
         <w:lastRenderedPageBreak/>
-        <w:t xml:space="preserve">level of intent/context. This means we will evaluate both the external </w:t>
-      </w:r>
-      <w:proofErr w:type="spellStart"/>
-      <w:r>
-        <w:rPr>
-          <w:rFonts w:ascii="Calibri" w:hAnsi="Calibri" w:cs="Calibri"/>
-          <w:lang w:val="en-IN"/>
-        </w:rPr>
-        <w:t>behavior</w:t>
-      </w:r>
-      <w:proofErr w:type="spellEnd"/>
-      <w:r>
-        <w:rPr>
-          <w:rFonts w:ascii="Calibri" w:hAnsi="Calibri" w:cs="Calibri"/>
-          <w:lang w:val="en-IN"/>
-        </w:rPr>
-        <w:t xml:space="preserve"> of the system (inputs and outputs) and certain internal aspects, with a range of test scenarios generated through constrained random stimulus.</w:t>
+        <w:t>level of intent/context. This means we will evaluate both the external behavior of the system (inputs and outputs) and certain internal aspects, with a range of test scenarios generated through constrained random stimulus.</w:t>
       </w:r>
     </w:p>
     <w:p>
@@ -7193,23 +6731,7 @@
           <w:rFonts w:ascii="Calibri" w:hAnsi="Calibri" w:cs="Calibri"/>
           <w:lang w:val="en-IN"/>
         </w:rPr>
-        <w:t xml:space="preserve"> Our checks will focus on the design context and microarchitecture levels, as we are primarily concerned with the </w:t>
-      </w:r>
-      <w:proofErr w:type="spellStart"/>
-      <w:r>
-        <w:rPr>
-          <w:rFonts w:ascii="Calibri" w:hAnsi="Calibri" w:cs="Calibri"/>
-          <w:lang w:val="en-IN"/>
-        </w:rPr>
-        <w:t>behavior</w:t>
-      </w:r>
-      <w:proofErr w:type="spellEnd"/>
-      <w:r>
-        <w:rPr>
-          <w:rFonts w:ascii="Calibri" w:hAnsi="Calibri" w:cs="Calibri"/>
-          <w:lang w:val="en-IN"/>
-        </w:rPr>
-        <w:t xml:space="preserve"> and functionality of the AHB-APB bridge and its components. We will verify that the design performs as intended in its context and that the microarchitecture operates correctly.</w:t>
+        <w:t xml:space="preserve"> Our checks will focus on the design context and microarchitecture levels, as we are primarily concerned with the behavior and functionality of the AHB-APB bridge and its components. We will verify that the design performs as intended in its context and that the microarchitecture operates correctly.</w:t>
       </w:r>
     </w:p>
     <w:p>
@@ -7310,21 +6832,7 @@
         <w:rPr>
           <w:rFonts w:ascii="Calibri" w:hAnsi="Calibri" w:cs="Calibri"/>
         </w:rPr>
-        <w:t xml:space="preserve">The target is to cover all functional stimulus requirements and to ensure the design has reached interesting points as well as corner cases. Coverage will be measured using code coverage tool in </w:t>
-      </w:r>
-      <w:proofErr w:type="spellStart"/>
-      <w:r>
-        <w:rPr>
-          <w:rFonts w:ascii="Calibri" w:hAnsi="Calibri" w:cs="Calibri"/>
-        </w:rPr>
-        <w:t>Questasim</w:t>
-      </w:r>
-      <w:proofErr w:type="spellEnd"/>
-      <w:r>
-        <w:rPr>
-          <w:rFonts w:ascii="Calibri" w:hAnsi="Calibri" w:cs="Calibri"/>
-        </w:rPr>
-        <w:t xml:space="preserve"> to ensure all lines of code and branches have been executed. We will also implement a transaction model checking and coverage to make sure we covered all the interesting bus transactions.</w:t>
+        <w:t>The target is to cover all functional stimulus requirements and to ensure the design has reached interesting points as well as corner cases. Coverage will be measured using code coverage tool in Questasim to ensure all lines of code and branches have been executed. We will also implement a transaction model checking and coverage to make sure we covered all the interesting bus transactions.</w:t>
       </w:r>
     </w:p>
     <w:p>
@@ -7338,35 +6846,7 @@
         <w:rPr>
           <w:rFonts w:ascii="Calibri" w:hAnsi="Calibri" w:cs="Calibri"/>
         </w:rPr>
-        <w:t xml:space="preserve">Formulate conditions of how you will achieve the goals. Explain the </w:t>
-      </w:r>
-      <w:proofErr w:type="spellStart"/>
-      <w:r>
-        <w:rPr>
-          <w:rFonts w:ascii="Calibri" w:hAnsi="Calibri" w:cs="Calibri"/>
-        </w:rPr>
-        <w:t>Covergroups</w:t>
-      </w:r>
-      <w:proofErr w:type="spellEnd"/>
-      <w:r>
-        <w:rPr>
-          <w:rFonts w:ascii="Calibri" w:hAnsi="Calibri" w:cs="Calibri"/>
-        </w:rPr>
-        <w:t xml:space="preserve"> and </w:t>
-      </w:r>
-      <w:proofErr w:type="spellStart"/>
-      <w:r>
-        <w:rPr>
-          <w:rFonts w:ascii="Calibri" w:hAnsi="Calibri" w:cs="Calibri"/>
-        </w:rPr>
-        <w:t>Coverpoints</w:t>
-      </w:r>
-      <w:proofErr w:type="spellEnd"/>
-      <w:r>
-        <w:rPr>
-          <w:rFonts w:ascii="Calibri" w:hAnsi="Calibri" w:cs="Calibri"/>
-        </w:rPr>
-        <w:t xml:space="preserve"> and your selection of bins.</w:t>
+        <w:t>Formulate conditions of how you will achieve the goals. Explain the Covergroups and Coverpoints and your selection of bins.</w:t>
       </w:r>
     </w:p>
     <w:p>
@@ -7779,13 +7259,7 @@
         <w:rPr>
           <w:rFonts w:ascii="Calibri" w:hAnsi="Calibri" w:cs="Calibri"/>
         </w:rPr>
-        <w:t>Two graduate students</w:t>
-      </w:r>
-      <w:r>
-        <w:rPr>
-          <w:rFonts w:ascii="Calibri" w:hAnsi="Calibri" w:cs="Calibri"/>
-        </w:rPr>
-        <w:t xml:space="preserve"> work.</w:t>
+        <w:t>Two graduate students work.</w:t>
       </w:r>
     </w:p>
     <w:p>
@@ -7804,13 +7278,7 @@
         <w:rPr>
           <w:rFonts w:ascii="Calibri" w:hAnsi="Calibri" w:cs="Calibri"/>
         </w:rPr>
-        <w:t>computing resources</w:t>
-      </w:r>
-      <w:r>
-        <w:rPr>
-          <w:rFonts w:ascii="Calibri" w:hAnsi="Calibri" w:cs="Calibri"/>
-        </w:rPr>
-        <w:t>.</w:t>
+        <w:t>computing resources.</w:t>
       </w:r>
     </w:p>
     <w:p>
@@ -11847,6 +11315,7 @@
   <w:style w:type="character" w:default="1" w:styleId="DefaultParagraphFont">
     <w:name w:val="Default Paragraph Font"/>
     <w:uiPriority w:val="1"/>
+    <w:semiHidden/>
     <w:unhideWhenUsed/>
   </w:style>
   <w:style w:type="table" w:default="1" w:styleId="TableNormal">

</xml_diff>